<commit_message>
fix: resume timeline - adds current work history
</commit_message>
<xml_diff>
--- a/public/resume-latest.docx
+++ b/public/resume-latest.docx
@@ -1575,7 +1575,27 @@
           <w:szCs w:val="20"/>
           <w:lang w:val="en-US"/>
         </w:rPr>
-        <w:t>) (realty live – mobile app)</w:t>
+        <w:t>)</w:t>
+      </w:r>
+      <w:r>
+        <w:rPr>
+          <w:rFonts w:ascii="Tahoma" w:hAnsi="Tahoma" w:cs="Tahoma"/>
+          <w:color w:val="404040" w:themeColor="text1" w:themeTint="BF"/>
+          <w:sz w:val="20"/>
+          <w:szCs w:val="20"/>
+          <w:lang w:val="en-US"/>
+        </w:rPr>
+        <w:t xml:space="preserve">, </w:t>
+      </w:r>
+      <w:r>
+        <w:rPr>
+          <w:rFonts w:ascii="Tahoma" w:hAnsi="Tahoma" w:cs="Tahoma"/>
+          <w:color w:val="404040" w:themeColor="text1" w:themeTint="BF"/>
+          <w:sz w:val="20"/>
+          <w:szCs w:val="20"/>
+          <w:lang w:val="en-US"/>
+        </w:rPr>
+        <w:t>(realty live – mobile app)</w:t>
       </w:r>
       <w:r>
         <w:rPr>
@@ -1607,7 +1627,37 @@
           <w:szCs w:val="20"/>
           <w:lang w:val="en-US"/>
         </w:rPr>
-        <w:t>) (</w:t>
+        <w:t>)</w:t>
+      </w:r>
+      <w:r>
+        <w:rPr>
+          <w:rFonts w:ascii="Tahoma" w:hAnsi="Tahoma" w:cs="Tahoma"/>
+          <w:color w:val="404040" w:themeColor="text1" w:themeTint="BF"/>
+          <w:sz w:val="20"/>
+          <w:szCs w:val="20"/>
+          <w:lang w:val="en-US"/>
+        </w:rPr>
+        <w:t xml:space="preserve">, </w:t>
+      </w:r>
+      <w:r>
+        <w:rPr>
+          <w:rFonts w:ascii="Tahoma" w:hAnsi="Tahoma" w:cs="Tahoma"/>
+          <w:color w:val="404040" w:themeColor="text1" w:themeTint="BF"/>
+          <w:sz w:val="20"/>
+          <w:szCs w:val="20"/>
+          <w:lang w:val="en-US"/>
+        </w:rPr>
+        <w:t>(</w:t>
+      </w:r>
+      <w:r>
+        <w:rPr>
+          <w:rFonts w:ascii="Tahoma" w:hAnsi="Tahoma" w:cs="Tahoma"/>
+          <w:color w:val="404040" w:themeColor="text1" w:themeTint="BF"/>
+          <w:sz w:val="20"/>
+          <w:szCs w:val="20"/>
+          <w:lang w:val="en-US"/>
+        </w:rPr>
+        <w:t>Party Bus -</w:t>
       </w:r>
       <w:proofErr w:type="spellStart"/>
       <w:r>
@@ -1618,7 +1668,17 @@
           <w:szCs w:val="20"/>
           <w:lang w:val="en-US"/>
         </w:rPr>
-        <w:t>Elementor</w:t>
+        <w:t xml:space="preserve"> </w:t>
+      </w:r>
+      <w:r>
+        <w:rPr>
+          <w:rFonts w:ascii="Tahoma" w:hAnsi="Tahoma" w:cs="Tahoma"/>
+          <w:color w:val="404040" w:themeColor="text1" w:themeTint="BF"/>
+          <w:sz w:val="20"/>
+          <w:szCs w:val="20"/>
+          <w:lang w:val="en-US"/>
+        </w:rPr>
+        <w:t>Elemento</w:t>
       </w:r>
       <w:proofErr w:type="spellEnd"/>
       <w:r>
@@ -1629,7 +1689,7 @@
           <w:szCs w:val="20"/>
           <w:lang w:val="en-US"/>
         </w:rPr>
-        <w:t xml:space="preserve"> WP Projects)</w:t>
+        <w:t>r WP Projects)</w:t>
       </w:r>
     </w:p>
     <w:p>
@@ -1838,7 +1898,19 @@
         <w:rPr>
           <w:lang w:val="en-US"/>
         </w:rPr>
-        <w:t>backend and Postgres.</w:t>
+        <w:t>backend and Postgres</w:t>
+      </w:r>
+      <w:r>
+        <w:rPr>
+          <w:lang w:val="en-US"/>
+        </w:rPr>
+        <w:t xml:space="preserve"> using TypeOrm</w:t>
+      </w:r>
+      <w:r>
+        <w:rPr>
+          <w:lang w:val="en-US"/>
+        </w:rPr>
+        <w:t>.</w:t>
       </w:r>
     </w:p>
     <w:p>
@@ -1875,6 +1947,12 @@
           <w:lang w:val="en-US"/>
         </w:rPr>
         <w:t>Added Server-Sent Events for notification</w:t>
+      </w:r>
+      <w:r>
+        <w:rPr>
+          <w:lang w:val="en-US"/>
+        </w:rPr>
+        <w:t xml:space="preserve"> and chat</w:t>
       </w:r>
     </w:p>
     <w:p>

</xml_diff>